<commit_message>
Update Sumário - Projeto Final.docx
</commit_message>
<xml_diff>
--- a/Sumário - Projeto Final.docx
+++ b/Sumário - Projeto Final.docx
@@ -2975,14 +2975,15 @@
         <w:rPr>
           <w:rFonts w:ascii="Arial" w:hAnsi="Arial" w:cs="Arial"/>
           <w:b/>
+          <w:noProof/>
           <w:sz w:val="24"/>
           <w:szCs w:val="24"/>
         </w:rPr>
         <w:drawing>
-          <wp:inline distT="0" distB="0" distL="0" distR="0" wp14:anchorId="4FC033EC" wp14:editId="27B97B61">
-            <wp:extent cx="5759450" cy="2283460"/>
-            <wp:effectExtent l="0" t="0" r="0" b="2540"/>
-            <wp:docPr id="337091244" name="Imagem 1"/>
+          <wp:inline distT="0" distB="0" distL="0" distR="0" wp14:anchorId="4955219D" wp14:editId="3EC6AF1D">
+            <wp:extent cx="5743575" cy="2286000"/>
+            <wp:effectExtent l="0" t="0" r="9525" b="0"/>
+            <wp:docPr id="1076560241" name="Imagem 1"/>
             <wp:cNvGraphicFramePr>
               <a:graphicFrameLocks xmlns:a="http://schemas.openxmlformats.org/drawingml/2006/main" noChangeAspect="1"/>
             </wp:cNvGraphicFramePr>
@@ -2990,23 +2991,36 @@
               <a:graphicData uri="http://schemas.openxmlformats.org/drawingml/2006/picture">
                 <pic:pic xmlns:pic="http://schemas.openxmlformats.org/drawingml/2006/picture">
                   <pic:nvPicPr>
-                    <pic:cNvPr id="337091244" name=""/>
-                    <pic:cNvPicPr/>
+                    <pic:cNvPr id="0" name="Picture 1"/>
+                    <pic:cNvPicPr>
+                      <a:picLocks noChangeAspect="1" noChangeArrowheads="1"/>
+                    </pic:cNvPicPr>
                   </pic:nvPicPr>
                   <pic:blipFill>
-                    <a:blip r:embed="rId7"/>
+                    <a:blip r:embed="rId7" cstate="print">
+                      <a:extLst>
+                        <a:ext uri="{28A0092B-C50C-407E-A947-70E740481C1C}">
+                          <a14:useLocalDpi xmlns:a14="http://schemas.microsoft.com/office/drawing/2010/main" val="0"/>
+                        </a:ext>
+                      </a:extLst>
+                    </a:blip>
+                    <a:srcRect/>
                     <a:stretch>
                       <a:fillRect/>
                     </a:stretch>
                   </pic:blipFill>
-                  <pic:spPr>
+                  <pic:spPr bwMode="auto">
                     <a:xfrm>
                       <a:off x="0" y="0"/>
-                      <a:ext cx="5759450" cy="2283460"/>
+                      <a:ext cx="5743575" cy="2286000"/>
                     </a:xfrm>
                     <a:prstGeom prst="rect">
                       <a:avLst/>
                     </a:prstGeom>
+                    <a:noFill/>
+                    <a:ln>
+                      <a:noFill/>
+                    </a:ln>
                   </pic:spPr>
                 </pic:pic>
               </a:graphicData>

</xml_diff>